<commit_message>
Update GQ00-GQ04 student guides and download instructions
</commit_message>
<xml_diff>
--- a/downloads/qgis/GQ00_Odigos_Foititi_v2.0.docx
+++ b/downloads/qgis/GQ00_Odigos_Foititi_v2.0.docx
@@ -20,6 +20,92 @@
       <w:r>
         <w:br/>
         <w:t>Πρακτική εισαγωγή στη δημιουργία, συμβολογία και αποθήκευση ενός έργου QGIS.</w:t>
+      </w:r>
+    </w:p>
+    <w:p>
+      <w:pPr>
+        <w:pStyle w:val="Heading1"/>
+      </w:pPr>
+      <w:r>
+        <w:t>Συνοδευτικό υλικό και λήψεις</w:t>
+      </w:r>
+    </w:p>
+    <w:p>
+      <w:pPr/>
+      <w:r>
+        <w:t xml:space="preserve">Σταθερή δημόσια σελίδα μαθήματος: </w:t>
+      </w:r>
+      <w:hyperlink r:id="rId13">
+        <w:r>
+          <w:rPr>
+            <w:color w:val="0563C1"/>
+            <w:u w:val="single"/>
+          </w:rPr>
+          <w:t>GQ00 στο GeoSkills</w:t>
+        </w:r>
+      </w:hyperlink>
+    </w:p>
+    <w:p>
+      <w:pPr/>
+      <w:r>
+        <w:t>Επιλογή Α — πλήρες πακέτο: κατέβασε το ZIP και αποσυμπίεσέ το σε μόνιμο φάκελο εργασίας. Μην επεξεργάζεσαι αρχεία μέσα από το ZIP.</w:t>
+      </w:r>
+    </w:p>
+    <w:p>
+      <w:pPr/>
+      <w:r>
+        <w:t xml:space="preserve">Λήψη πλήρους πακέτου: </w:t>
+      </w:r>
+      <w:hyperlink r:id="rId14">
+        <w:r>
+          <w:rPr>
+            <w:color w:val="0563C1"/>
+            <w:u w:val="single"/>
+          </w:rPr>
+          <w:t>GQ00_student_v2.0.zip</w:t>
+        </w:r>
+      </w:hyperlink>
+    </w:p>
+    <w:p>
+      <w:pPr/>
+      <w:r>
+        <w:t>Επιλογή Β — μεμονωμένα αρχεία: δημιούργησε τον φάκελο GQ00_εργασία/ με υποφακέλους data/, projects/ και exercises/. Αποθήκευσε τα δεδομένα στον data/ και το έργο σου στον projects/.</w:t>
+      </w:r>
+    </w:p>
+    <w:p>
+      <w:pPr/>
+      <w:r>
+        <w:t xml:space="preserve">Κύριο dataset: </w:t>
+      </w:r>
+      <w:hyperlink r:id="rId15">
+        <w:r>
+          <w:rPr>
+            <w:color w:val="0563C1"/>
+            <w:u w:val="single"/>
+          </w:rPr>
+          <w:t>GQ00_world_countries_v2.0.gpkg</w:t>
+        </w:r>
+      </w:hyperlink>
+    </w:p>
+    <w:p>
+      <w:pPr/>
+      <w:r>
+        <w:t xml:space="preserve">Επεξεργάσιμο φύλλο εργασίας Word: </w:t>
+      </w:r>
+      <w:hyperlink r:id="rId16">
+        <w:r>
+          <w:rPr>
+            <w:color w:val="0563C1"/>
+            <w:u w:val="single"/>
+          </w:rPr>
+          <w:t>GQ00_Fyllo_Ergasias_v2.0.docx</w:t>
+        </w:r>
+      </w:hyperlink>
+    </w:p>
+    <w:p>
+      <w:pPr/>
+      <w:r>
+        <w:t>Συμπλήρωσε το φύλλο εργασίας είτε ως exercises/GQ00_fyllo_ergasias.md από το ZIP είτε στο ξεχωριστό Word. Παρέδωσε το συμπληρωμένο αρχείο ως Markdown (.md) ή Word (.docx), μαζί με το QGIS project projects/GQ00_my_first_map.qgz όπου προβλέπεται.</w:t>
       </w:r>
     </w:p>
     <w:p>

</xml_diff>